<commit_message>
made an edit to poc strategy doc
</commit_message>
<xml_diff>
--- a/Data Preparation/poc_strategy_final.docx
+++ b/Data Preparation/poc_strategy_final.docx
@@ -18,8 +18,10 @@
         <w:rPr>
           <w:color w:val="444444"/>
         </w:rPr>
-        <w:t>This document outlines the train-test strategy for evaluating Temporal Fusion Transformer (TFT) against the current production model (Snowflake ML Forecast / XGBoost) on the two-wheeler dealer-SKU forecasting problem.</w:t>
+        <w:t xml:space="preserve">This document outlines the train-test strategy for evaluating Temporal Fusion Transformer (TFT) against the current production model (Snowflake ML Forecast / XGBoost) </w:t>
       </w:r>
+      <w:bookmarkStart w:id="0" w:name="_GoBack"/>
+      <w:bookmarkEnd w:id="0"/>
     </w:p>
     <w:p>
       <w:pPr>
@@ -2106,6 +2108,7 @@
         <w:spacing w:after="120"/>
       </w:pPr>
       <w:r>
+        <w:lastRenderedPageBreak/>
         <w:t xml:space="preserve">The table above reflects all unique combos across the full dataset. Since the training window is restricted to </w:t>
       </w:r>
       <w:r>
@@ -2116,7 +2119,7 @@
         <w:t>Jan 2022 to Sep 2025</w:t>
       </w:r>
       <w:r>
-        <w:t xml:space="preserve">, the count of unique dealer-model family combinations within the training set differs and is shown below.</w:t>
+        <w:t>, the count of unique dealer-model family combinations within the training set differs and is shown below.</w:t>
       </w:r>
     </w:p>
     <w:tbl>
@@ -2165,7 +2168,17 @@
                 <w:sz w:val="20"/>
                 <w:szCs w:val="20"/>
               </w:rPr>
-              <w:t>Months of Data Available</w:t>
+              <w:t>Months of Data Ava</w:t>
+            </w:r>
+            <w:r>
+              <w:rPr>
+                <w:b/>
+                <w:bCs/>
+                <w:color w:val="FFFFFF"/>
+                <w:sz w:val="20"/>
+                <w:szCs w:val="20"/>
+              </w:rPr>
+              <w:t>ilable</w:t>
             </w:r>
           </w:p>
         </w:tc>
@@ -2304,7 +2317,17 @@
                 <w:sz w:val="20"/>
                 <w:szCs w:val="20"/>
               </w:rPr>
-              <w:t>✓ Yes</w:t>
+              <w:t>✓</w:t>
+            </w:r>
+            <w:r>
+              <w:rPr>
+                <w:b/>
+                <w:bCs/>
+                <w:color w:val="1E5C1E"/>
+                <w:sz w:val="20"/>
+                <w:szCs w:val="20"/>
+              </w:rPr>
+              <w:t xml:space="preserve"> Yes</w:t>
             </w:r>
           </w:p>
         </w:tc>
@@ -2381,7 +2404,15 @@
                 <w:sz w:val="20"/>
                 <w:szCs w:val="20"/>
               </w:rPr>
-              <w:t>✗ Excluded</w:t>
+              <w:t>✗</w:t>
+            </w:r>
+            <w:r>
+              <w:rPr>
+                <w:color w:val="888888"/>
+                <w:sz w:val="20"/>
+                <w:szCs w:val="20"/>
+              </w:rPr>
+              <w:t xml:space="preserve"> Excluded</w:t>
             </w:r>
           </w:p>
         </w:tc>
@@ -2458,7 +2489,15 @@
                 <w:sz w:val="20"/>
                 <w:szCs w:val="20"/>
               </w:rPr>
-              <w:t>✗ Excluded</w:t>
+              <w:t>✗</w:t>
+            </w:r>
+            <w:r>
+              <w:rPr>
+                <w:color w:val="888888"/>
+                <w:sz w:val="20"/>
+                <w:szCs w:val="20"/>
+              </w:rPr>
+              <w:t xml:space="preserve"> Excluded</w:t>
             </w:r>
           </w:p>
         </w:tc>
@@ -2535,7 +2574,15 @@
                 <w:sz w:val="20"/>
                 <w:szCs w:val="20"/>
               </w:rPr>
-              <w:t>✗ Excluded</w:t>
+              <w:t>✗</w:t>
+            </w:r>
+            <w:r>
+              <w:rPr>
+                <w:color w:val="888888"/>
+                <w:sz w:val="20"/>
+                <w:szCs w:val="20"/>
+              </w:rPr>
+              <w:t xml:space="preserve"> Excluded</w:t>
             </w:r>
           </w:p>
         </w:tc>
@@ -2628,8 +2675,6 @@
       <w:pPr>
         <w:spacing w:after="240"/>
       </w:pPr>
-      <w:bookmarkStart w:id="0" w:name="_GoBack"/>
-      <w:bookmarkEnd w:id="0"/>
     </w:p>
     <w:p>
       <w:pPr>
@@ -2689,10 +2734,55 @@
           <w:szCs w:val="20"/>
         </w:rPr>
         <w:t>Note: TFT has access to static dealer and product attributes that Snowflake ML Forecast does not natively support. Any performance improvement from TFT therefore reflects both the architectural advantage of TFT and the additional covariate information it can consume.</w:t>
+      </w:r>
+      <w:r>
+        <w:rPr>
+          <w:i/>
+          <w:iCs/>
+          <w:color w:val="555555"/>
+          <w:sz w:val="20"/>
+          <w:szCs w:val="20"/>
+        </w:rPr>
         <w:tab/>
+      </w:r>
+      <w:r>
+        <w:rPr>
+          <w:i/>
+          <w:iCs/>
+          <w:color w:val="555555"/>
+          <w:sz w:val="20"/>
+          <w:szCs w:val="20"/>
+        </w:rPr>
         <w:tab/>
+      </w:r>
+      <w:r>
+        <w:rPr>
+          <w:i/>
+          <w:iCs/>
+          <w:color w:val="555555"/>
+          <w:sz w:val="20"/>
+          <w:szCs w:val="20"/>
+        </w:rPr>
         <w:tab/>
+      </w:r>
+      <w:r>
+        <w:rPr>
+          <w:i/>
+          <w:iCs/>
+          <w:color w:val="555555"/>
+          <w:sz w:val="20"/>
+          <w:szCs w:val="20"/>
+        </w:rPr>
         <w:tab/>
+      </w:r>
+      <w:r>
+        <w:rPr>
+          <w:i/>
+          <w:iCs/>
+          <w:color w:val="555555"/>
+          <w:sz w:val="20"/>
+          <w:szCs w:val="20"/>
+        </w:rPr>
         <w:tab/>
       </w:r>
     </w:p>
@@ -3764,7 +3854,7 @@
 </file>
 
 <file path=customXml/itemProps1.xml><?xml version="1.0" encoding="utf-8"?>
-<ds:datastoreItem xmlns:ds="http://schemas.openxmlformats.org/officeDocument/2006/customXml" ds:itemID="{169C70F4-83BB-4C52-9F4B-925C893D19E1}">
+<ds:datastoreItem xmlns:ds="http://schemas.openxmlformats.org/officeDocument/2006/customXml" ds:itemID="{7E3613A4-77B7-48B0-A2A3-9F307982548F}">
   <ds:schemaRefs>
     <ds:schemaRef ds:uri="http://schemas.openxmlformats.org/officeDocument/2006/bibliography"/>
   </ds:schemaRefs>

</xml_diff>